<commit_message>
Precisar en la carta las fichas subsanadas del desinfectante SQP - MIKROVAL
Co-Authored-By: Claude Opus 5.5 <noreply@anthropic.com>
Claude-Session: https://claude.ai/code/session_01Ls5dNjYBLNjXxuGTDk7v3H
</commit_message>
<xml_diff>
--- a/carta-reclamo/Carta_Reclamo_Direccion_Compras_Electronicas.docx
+++ b/carta-reclamo/Carta_Reclamo_Direccion_Compras_Electronicas.docx
@@ -89,7 +89,23 @@
         <w:t xml:space="preserve"> </w:t>
       </w:r>
       <w:r>
-        <w:t xml:space="preserve">no visibles para los proveedores en la plataforma de Catálogos Electrónicos, fichas subsanadas sin respuesta desde hace meses y comunicaciones sin contestar.</w:t>
+        <w:t xml:space="preserve">no visibles para los proveedores en la plataforma de Catálogos Electrónicos, fichas-producto subsanadas del desinfectante</w:t>
+      </w:r>
+      <w:r>
+        <w:t xml:space="preserve"> </w:t>
+      </w:r>
+      <w:r>
+        <w:rPr>
+          <w:bCs/>
+          <w:b/>
+        </w:rPr>
+        <w:t xml:space="preserve">SQP – MIKROVAL</w:t>
+      </w:r>
+      <w:r>
+        <w:t xml:space="preserve"> </w:t>
+      </w:r>
+      <w:r>
+        <w:t xml:space="preserve">sin respuesta desde hace meses y observadas por causa imputable a PERÚ COMPRAS, y comunicaciones sin contestar.</w:t>
       </w:r>
     </w:p>
     <w:p>
@@ -738,13 +754,13 @@
       </w:r>
     </w:p>
     <w:bookmarkEnd w:id="20"/>
-    <w:bookmarkStart w:id="21" w:name="Xa0bdfb105efd4b57cebe640dcb8fde3ff262d36"/>
+    <w:bookmarkStart w:id="21" w:name="Xd7803be0df2bb08b66bfbf9aa12309211bd6f6f"/>
     <w:p>
       <w:pPr>
         <w:pStyle w:val="Heading3"/>
       </w:pPr>
       <w:r>
-        <w:t xml:space="preserve">1.2. Fichas subsanadas hace más de tres meses sin respuesta</w:t>
+        <w:t xml:space="preserve">1.2. Fichas subsanadas del desinfectante SQP – MIKROVAL: más de tres meses sin respuesta</w:t>
       </w:r>
     </w:p>
     <w:p>
@@ -768,7 +784,160 @@
         <w:t xml:space="preserve"> </w:t>
       </w:r>
       <w:r>
-        <w:t xml:space="preserve">(alrededor de julio de 2026) subsanamos nuestras fichas-producto dentro del plazo. El 31 de agosto escribimos para pedir una respuesta. El 4 de septiembre su Dirección nos pidió llenar un archivo Excel para identificar las fichas, y</w:t>
+        <w:t xml:space="preserve">(alrededor de julio de 2026) subsanamos dentro del plazo las fichas-producto de nuestro</w:t>
+      </w:r>
+      <w:r>
+        <w:t xml:space="preserve"> </w:t>
+      </w:r>
+      <w:r>
+        <w:rPr>
+          <w:bCs/>
+          <w:b/>
+        </w:rPr>
+        <w:t xml:space="preserve">desinfectante a base de amonio cuaternario de quinta generación, marca SQP – MIKROVAL</w:t>
+      </w:r>
+      <w:r>
+        <w:t xml:space="preserve">, del Catálogo Electrónico de</w:t>
+      </w:r>
+      <w:r>
+        <w:t xml:space="preserve"> </w:t>
+      </w:r>
+      <w:r>
+        <w:rPr>
+          <w:bCs/>
+          <w:b/>
+        </w:rPr>
+        <w:t xml:space="preserve">Materiales e Insumos de Limpieza</w:t>
+      </w:r>
+      <w:r>
+        <w:t xml:space="preserve">:</w:t>
+      </w:r>
+    </w:p>
+    <w:tbl>
+      <w:tblPr>
+        <w:tblStyle w:val="Table"/>
+        <w:tblW w:type="pct" w:w="5000"/>
+        <w:tblLook w:firstRow="1" w:lastRow="0" w:firstColumn="0" w:lastColumn="0" w:noHBand="0" w:noVBand="0" w:val="0020"/>
+        <w:jc w:val="start"/>
+      </w:tblPr>
+      <w:tblGrid>
+        <w:gridCol w:w="3960"/>
+        <w:gridCol w:w="3960"/>
+      </w:tblGrid>
+      <w:tr>
+        <w:trPr>
+          <w:tblHeader w:val="true"/>
+        </w:trPr>
+        <w:tc>
+          <w:tcPr/>
+          <w:p>
+            <w:pPr>
+              <w:pStyle w:val="Compact"/>
+              <w:jc w:val="left"/>
+            </w:pPr>
+            <w:r>
+              <w:t xml:space="preserve">Código / N.° de parte</w:t>
+            </w:r>
+          </w:p>
+        </w:tc>
+        <w:tc>
+          <w:tcPr/>
+          <w:p>
+            <w:pPr>
+              <w:pStyle w:val="Compact"/>
+              <w:jc w:val="left"/>
+            </w:pPr>
+            <w:r>
+              <w:t xml:space="preserve">Descripción de la ficha-producto</w:t>
+            </w:r>
+          </w:p>
+        </w:tc>
+      </w:tr>
+      <w:tr>
+        <w:tc>
+          <w:tcPr/>
+          <w:p>
+            <w:pPr>
+              <w:pStyle w:val="Compact"/>
+              <w:jc w:val="left"/>
+            </w:pPr>
+            <w:r>
+              <w:t xml:space="preserve">MIKROVAL_001</w:t>
+            </w:r>
+          </w:p>
+        </w:tc>
+        <w:tc>
+          <w:tcPr/>
+          <w:p>
+            <w:pPr>
+              <w:pStyle w:val="Compact"/>
+              <w:jc w:val="left"/>
+            </w:pPr>
+            <w:r>
+              <w:t xml:space="preserve">Desinfectantes: líquido amonio cuaternario de quinta generación doméstico / industrial / salud pública. Cont.: frasco x 1 L. G.F.: 24 meses – 2 años. Unidad. SQP-MIKROVAL</w:t>
+            </w:r>
+          </w:p>
+        </w:tc>
+      </w:tr>
+      <w:tr>
+        <w:tc>
+          <w:tcPr/>
+          <w:p>
+            <w:pPr>
+              <w:pStyle w:val="Compact"/>
+              <w:jc w:val="left"/>
+            </w:pPr>
+            <w:r>
+              <w:t xml:space="preserve">MIKROVAL_002</w:t>
+            </w:r>
+          </w:p>
+        </w:tc>
+        <w:tc>
+          <w:tcPr/>
+          <w:p>
+            <w:pPr>
+              <w:pStyle w:val="Compact"/>
+              <w:jc w:val="left"/>
+            </w:pPr>
+            <w:r>
+              <w:t xml:space="preserve">Ídem. Cont.: galón x 3.785 L</w:t>
+            </w:r>
+          </w:p>
+        </w:tc>
+      </w:tr>
+      <w:tr>
+        <w:tc>
+          <w:tcPr/>
+          <w:p>
+            <w:pPr>
+              <w:pStyle w:val="Compact"/>
+              <w:jc w:val="left"/>
+            </w:pPr>
+            <w:r>
+              <w:t xml:space="preserve">MIKROVAL_003</w:t>
+            </w:r>
+          </w:p>
+        </w:tc>
+        <w:tc>
+          <w:tcPr/>
+          <w:p>
+            <w:pPr>
+              <w:pStyle w:val="Compact"/>
+              <w:jc w:val="left"/>
+            </w:pPr>
+            <w:r>
+              <w:t xml:space="preserve">Ídem. Cont.: bidón x 5 GL</w:t>
+            </w:r>
+          </w:p>
+        </w:tc>
+      </w:tr>
+    </w:tbl>
+    <w:p>
+      <w:pPr>
+        <w:pStyle w:val="BodyText"/>
+      </w:pPr>
+      <w:r>
+        <w:t xml:space="preserve">El 31 de agosto escribimos para pedir una respuesta. El 4 de septiembre su Dirección nos pidió llenar un archivo Excel para identificar las fichas, y</w:t>
       </w:r>
       <w:r>
         <w:t xml:space="preserve"> </w:t>
@@ -880,7 +1049,23 @@
         <w:t xml:space="preserve"> </w:t>
       </w:r>
       <w:r>
-        <w:t xml:space="preserve">nuestras fichas fueron</w:t>
+        <w:t xml:space="preserve">las tres fichas-producto del desinfectante</w:t>
+      </w:r>
+      <w:r>
+        <w:t xml:space="preserve"> </w:t>
+      </w:r>
+      <w:r>
+        <w:rPr>
+          <w:bCs/>
+          <w:b/>
+        </w:rPr>
+        <w:t xml:space="preserve">SQP – MIKROVAL</w:t>
+      </w:r>
+      <w:r>
+        <w:t xml:space="preserve"> </w:t>
+      </w:r>
+      <w:r>
+        <w:t xml:space="preserve">(MIKROVAL_001, _002 y _003; entre ellas la ficha N.° 2007274) fueron</w:t>
       </w:r>
       <w:r>
         <w:t xml:space="preserve"> </w:t>
@@ -896,7 +1081,25 @@
         <w:t xml:space="preserve"> </w:t>
       </w:r>
       <w:r>
-        <w:t xml:space="preserve">con este texto:</w:t>
+        <w:t xml:space="preserve">con la causal</w:t>
+      </w:r>
+      <w:r>
+        <w:t xml:space="preserve"> </w:t>
+      </w:r>
+      <w:r>
+        <w:t xml:space="preserve">“</w:t>
+      </w:r>
+      <w:r>
+        <w:t xml:space="preserve">Otros</w:t>
+      </w:r>
+      <w:r>
+        <w:t xml:space="preserve">”</w:t>
+      </w:r>
+      <w:r>
+        <w:t xml:space="preserve"> </w:t>
+      </w:r>
+      <w:r>
+        <w:t xml:space="preserve">y este texto:</w:t>
       </w:r>
       <w:r>
         <w:t xml:space="preserve"> </w:t>
@@ -967,7 +1170,7 @@
         <w:t xml:space="preserve">no pueden afectar a los representantes de marca</w:t>
       </w:r>
       <w:r>
-        <w:t xml:space="preserve">. El 30 de septiembre preguntamos cuándo se formalizaría el Acuerdo y si nuestras fichas se habilitarían automáticamente.</w:t>
+        <w:t xml:space="preserve">. El 30 de septiembre preguntamos cuándo se formalizaría el Acuerdo y si las fichas MIKROVAL se habilitarían automáticamente.</w:t>
       </w:r>
       <w:r>
         <w:t xml:space="preserve"> </w:t>
@@ -1404,7 +1607,23 @@
         <w:t xml:space="preserve"> </w:t>
       </w:r>
       <w:r>
-        <w:t xml:space="preserve">del 29 de septiembre de 2026, porque la causa es exclusivamente de PERÚ COMPRAS.</w:t>
+        <w:t xml:space="preserve">del 29 de septiembre de 2026 a las fichas</w:t>
+      </w:r>
+      <w:r>
+        <w:t xml:space="preserve"> </w:t>
+      </w:r>
+      <w:r>
+        <w:rPr>
+          <w:bCs/>
+          <w:b/>
+        </w:rPr>
+        <w:t xml:space="preserve">SQP – MIKROVAL</w:t>
+      </w:r>
+      <w:r>
+        <w:t xml:space="preserve"> </w:t>
+      </w:r>
+      <w:r>
+        <w:t xml:space="preserve">(MIKROVAL_001, _002 y _003), porque la causa es exclusivamente de PERÚ COMPRAS.</w:t>
       </w:r>
     </w:p>
     <w:p>
@@ -1426,7 +1645,23 @@
         <w:t xml:space="preserve"> </w:t>
       </w:r>
       <w:r>
-        <w:t xml:space="preserve">las fichas-producto que subsanamos hace meses, detalladas en el Excel enviado el 4 de septiembre de 2026.</w:t>
+        <w:t xml:space="preserve">las fichas-producto del desinfectante</w:t>
+      </w:r>
+      <w:r>
+        <w:t xml:space="preserve"> </w:t>
+      </w:r>
+      <w:r>
+        <w:rPr>
+          <w:bCs/>
+          <w:b/>
+        </w:rPr>
+        <w:t xml:space="preserve">SQP – MIKROVAL</w:t>
+      </w:r>
+      <w:r>
+        <w:t xml:space="preserve"> </w:t>
+      </w:r>
+      <w:r>
+        <w:t xml:space="preserve">que subsanamos hace meses y que detallamos en el Excel enviado el 4 de septiembre de 2026, sin exigirnos repetir un trámite que cumplimos a tiempo.</w:t>
       </w:r>
     </w:p>
     <w:p>
@@ -1906,7 +2141,7 @@
         <w:t xml:space="preserve"> </w:t>
       </w:r>
       <w:r>
-        <w:t xml:space="preserve">Correos del 9, 14 y 30 de septiembre de 2026 (Acuerdo de Adhesión) y captura de la observación del 29 de septiembre de 2026.</w:t>
+        <w:t xml:space="preserve">Correos del 9, 14 y 30 de septiembre de 2026 (Acuerdo de Adhesión) y captura de la observación del 29 de septiembre de 2026 a las fichas SQP – MIKROVAL.</w:t>
       </w:r>
     </w:p>
     <w:p>

</xml_diff>